<commit_message>
Doi ten thu muc
</commit_message>
<xml_diff>
--- a/MoTaBaiToan.docx
+++ b/MoTaBaiToan.docx
@@ -174,7 +174,61 @@
           <w:sz w:val="26"/>
           <w:szCs w:val="26"/>
         </w:rPr>
-        <w:t xml:space="preserve"> là xây dựng một kho dữ liệu phục vụ phân tích hoạt động kinh doanh của sàn thương mại điện tử Olist. </w:t>
+        <w:t xml:space="preserve"> </w:t>
+      </w:r>
+      <w:proofErr w:type="spellStart"/>
+      <w:r>
+        <w:rPr>
+          <w:rFonts w:ascii="Times New Roman" w:hAnsi="Times New Roman" w:cs="Times New Roman"/>
+          <w:sz w:val="26"/>
+          <w:szCs w:val="26"/>
+        </w:rPr>
+        <w:t>là</w:t>
+      </w:r>
+      <w:proofErr w:type="spellEnd"/>
+      <w:r>
+        <w:rPr>
+          <w:rFonts w:ascii="Times New Roman" w:hAnsi="Times New Roman" w:cs="Times New Roman"/>
+          <w:sz w:val="26"/>
+          <w:szCs w:val="26"/>
+        </w:rPr>
+        <w:t xml:space="preserve"> </w:t>
+      </w:r>
+      <w:proofErr w:type="spellStart"/>
+      <w:r>
+        <w:rPr>
+          <w:rFonts w:ascii="Times New Roman" w:hAnsi="Times New Roman" w:cs="Times New Roman"/>
+          <w:sz w:val="26"/>
+          <w:szCs w:val="26"/>
+        </w:rPr>
+        <w:t>xây</w:t>
+      </w:r>
+      <w:proofErr w:type="spellEnd"/>
+      <w:r>
+        <w:rPr>
+          <w:rFonts w:ascii="Times New Roman" w:hAnsi="Times New Roman" w:cs="Times New Roman"/>
+          <w:sz w:val="26"/>
+          <w:szCs w:val="26"/>
+        </w:rPr>
+        <w:t xml:space="preserve"> </w:t>
+      </w:r>
+      <w:proofErr w:type="spellStart"/>
+      <w:r>
+        <w:rPr>
+          <w:rFonts w:ascii="Times New Roman" w:hAnsi="Times New Roman" w:cs="Times New Roman"/>
+          <w:sz w:val="26"/>
+          <w:szCs w:val="26"/>
+        </w:rPr>
+        <w:t>dựng</w:t>
+      </w:r>
+      <w:proofErr w:type="spellEnd"/>
+      <w:r>
+        <w:rPr>
+          <w:rFonts w:ascii="Times New Roman" w:hAnsi="Times New Roman" w:cs="Times New Roman"/>
+          <w:sz w:val="26"/>
+          <w:szCs w:val="26"/>
+        </w:rPr>
+        <w:t xml:space="preserve"> một kho dữ liệu phục vụ phân tích hoạt động kinh doanh của sàn thương mại điện tử Olist. </w:t>
       </w:r>
       <w:r>
         <w:rPr>
@@ -191,7 +245,61 @@
           <w:sz w:val="26"/>
           <w:szCs w:val="26"/>
         </w:rPr>
-        <w:t xml:space="preserve">có thể khai thác từ dữ liệu giao dịch, bao gồm doanh thu, tốc độ tăng trưởng doanh thu, số lượng đơn hàng, giá trị trung bình đơn hàng, tỷ lệ hủy đơn, phí vận chuyển, đóng góp doanh thu theo seller/category/khu vực và </w:t>
+        <w:t>có thể khai thác từ dữ liệu giao dịch, bao gồm doanh thu, tốc độ tăng trưởng doanh thu, số lượng đơn hàng, giá trị trung bình đơn hàng, tỷ lệ hủy đơn, phí vận chuyển, đóng góp doanh thu theo seller/category/</w:t>
+      </w:r>
+      <w:proofErr w:type="spellStart"/>
+      <w:r>
+        <w:rPr>
+          <w:rFonts w:ascii="Times New Roman" w:hAnsi="Times New Roman" w:cs="Times New Roman"/>
+          <w:sz w:val="26"/>
+          <w:szCs w:val="26"/>
+        </w:rPr>
+        <w:t>khu</w:t>
+      </w:r>
+      <w:proofErr w:type="spellEnd"/>
+      <w:r>
+        <w:rPr>
+          <w:rFonts w:ascii="Times New Roman" w:hAnsi="Times New Roman" w:cs="Times New Roman"/>
+          <w:sz w:val="26"/>
+          <w:szCs w:val="26"/>
+        </w:rPr>
+        <w:t xml:space="preserve"> </w:t>
+      </w:r>
+      <w:proofErr w:type="spellStart"/>
+      <w:r>
+        <w:rPr>
+          <w:rFonts w:ascii="Times New Roman" w:hAnsi="Times New Roman" w:cs="Times New Roman"/>
+          <w:sz w:val="26"/>
+          <w:szCs w:val="26"/>
+        </w:rPr>
+        <w:t>vực</w:t>
+      </w:r>
+      <w:proofErr w:type="spellEnd"/>
+      <w:r>
+        <w:rPr>
+          <w:rFonts w:ascii="Times New Roman" w:hAnsi="Times New Roman" w:cs="Times New Roman"/>
+          <w:sz w:val="26"/>
+          <w:szCs w:val="26"/>
+        </w:rPr>
+        <w:t xml:space="preserve"> </w:t>
+      </w:r>
+      <w:proofErr w:type="spellStart"/>
+      <w:r>
+        <w:rPr>
+          <w:rFonts w:ascii="Times New Roman" w:hAnsi="Times New Roman" w:cs="Times New Roman"/>
+          <w:sz w:val="26"/>
+          <w:szCs w:val="26"/>
+        </w:rPr>
+        <w:t>và</w:t>
+      </w:r>
+      <w:proofErr w:type="spellEnd"/>
+      <w:r>
+        <w:rPr>
+          <w:rFonts w:ascii="Times New Roman" w:hAnsi="Times New Roman" w:cs="Times New Roman"/>
+          <w:sz w:val="26"/>
+          <w:szCs w:val="26"/>
+        </w:rPr>
+        <w:t xml:space="preserve"> </w:t>
       </w:r>
       <w:proofErr w:type="spellStart"/>
       <w:r>
@@ -2840,6 +2948,7 @@
     <w:p>
       <w:pPr>
         <w:pStyle w:val="Heading1"/>
+        <w:spacing w:line="360" w:lineRule="auto"/>
         <w:rPr>
           <w:rFonts w:ascii="Times New Roman" w:hAnsi="Times New Roman" w:cs="Times New Roman"/>
           <w:color w:val="auto"/>
@@ -2854,16 +2963,7 @@
           <w:sz w:val="26"/>
           <w:szCs w:val="26"/>
         </w:rPr>
-        <w:t>2</w:t>
-      </w:r>
-      <w:r>
-        <w:rPr>
-          <w:rFonts w:ascii="Times New Roman" w:hAnsi="Times New Roman" w:cs="Times New Roman"/>
-          <w:color w:val="auto"/>
-          <w:sz w:val="26"/>
-          <w:szCs w:val="26"/>
-        </w:rPr>
-        <w:t xml:space="preserve">. </w:t>
+        <w:t xml:space="preserve">2. </w:t>
       </w:r>
       <w:proofErr w:type="spellStart"/>
       <w:r>
@@ -2963,7 +3063,47 @@
           <w:sz w:val="26"/>
           <w:szCs w:val="26"/>
         </w:rPr>
-        <w:t xml:space="preserve"> tích về </w:t>
+        <w:t xml:space="preserve"> </w:t>
+      </w:r>
+      <w:proofErr w:type="spellStart"/>
+      <w:r>
+        <w:rPr>
+          <w:rFonts w:ascii="Times New Roman" w:hAnsi="Times New Roman" w:cs="Times New Roman"/>
+          <w:color w:val="auto"/>
+          <w:sz w:val="26"/>
+          <w:szCs w:val="26"/>
+        </w:rPr>
+        <w:t>tích</w:t>
+      </w:r>
+      <w:proofErr w:type="spellEnd"/>
+      <w:r>
+        <w:rPr>
+          <w:rFonts w:ascii="Times New Roman" w:hAnsi="Times New Roman" w:cs="Times New Roman"/>
+          <w:color w:val="auto"/>
+          <w:sz w:val="26"/>
+          <w:szCs w:val="26"/>
+        </w:rPr>
+        <w:t xml:space="preserve"> </w:t>
+      </w:r>
+      <w:proofErr w:type="spellStart"/>
+      <w:r>
+        <w:rPr>
+          <w:rFonts w:ascii="Times New Roman" w:hAnsi="Times New Roman" w:cs="Times New Roman"/>
+          <w:color w:val="auto"/>
+          <w:sz w:val="26"/>
+          <w:szCs w:val="26"/>
+        </w:rPr>
+        <w:t>về</w:t>
+      </w:r>
+      <w:proofErr w:type="spellEnd"/>
+      <w:r>
+        <w:rPr>
+          <w:rFonts w:ascii="Times New Roman" w:hAnsi="Times New Roman" w:cs="Times New Roman"/>
+          <w:color w:val="auto"/>
+          <w:sz w:val="26"/>
+          <w:szCs w:val="26"/>
+        </w:rPr>
+        <w:t xml:space="preserve"> </w:t>
       </w:r>
       <w:proofErr w:type="spellStart"/>
       <w:r>
@@ -5051,530 +5191,6 @@
                 <w:szCs w:val="26"/>
               </w:rPr>
               <w:t>Customer Total Spend, Customer Cluster</w:t>
-            </w:r>
-          </w:p>
-        </w:tc>
-      </w:tr>
-      <w:tr>
-        <w:trPr>
-          <w:cantSplit/>
-          <w:trHeight w:val="576"/>
-          <w:jc w:val="center"/>
-        </w:trPr>
-        <w:tc>
-          <w:tcPr>
-            <w:tcW w:w="7201" w:type="dxa"/>
-            <w:tcBorders>
-              <w:top w:val="single" w:sz="4" w:space="0" w:color="BFBFBF"/>
-              <w:left w:val="single" w:sz="4" w:space="0" w:color="BFBFBF"/>
-              <w:bottom w:val="single" w:sz="4" w:space="0" w:color="BFBFBF"/>
-              <w:right w:val="single" w:sz="4" w:space="0" w:color="BFBFBF"/>
-            </w:tcBorders>
-            <w:vAlign w:val="center"/>
-          </w:tcPr>
-          <w:p>
-            <w:pPr>
-              <w:spacing w:before="100" w:beforeAutospacing="1" w:after="100" w:afterAutospacing="1" w:line="240" w:lineRule="auto"/>
-              <w:rPr>
-                <w:rFonts w:ascii="Times New Roman" w:hAnsi="Times New Roman" w:cs="Times New Roman"/>
-                <w:sz w:val="26"/>
-                <w:szCs w:val="26"/>
-                <w:highlight w:val="yellow"/>
-              </w:rPr>
-            </w:pPr>
-            <w:proofErr w:type="spellStart"/>
-            <w:r>
-              <w:rPr>
-                <w:rFonts w:ascii="Times New Roman" w:hAnsi="Times New Roman" w:cs="Times New Roman"/>
-                <w:sz w:val="26"/>
-                <w:szCs w:val="26"/>
-                <w:highlight w:val="yellow"/>
-              </w:rPr>
-              <w:t>Doanh</w:t>
-            </w:r>
-            <w:proofErr w:type="spellEnd"/>
-            <w:r>
-              <w:rPr>
-                <w:rFonts w:ascii="Times New Roman" w:hAnsi="Times New Roman" w:cs="Times New Roman"/>
-                <w:sz w:val="26"/>
-                <w:szCs w:val="26"/>
-                <w:highlight w:val="yellow"/>
-              </w:rPr>
-              <w:t xml:space="preserve"> </w:t>
-            </w:r>
-            <w:proofErr w:type="spellStart"/>
-            <w:r>
-              <w:rPr>
-                <w:rFonts w:ascii="Times New Roman" w:hAnsi="Times New Roman" w:cs="Times New Roman"/>
-                <w:sz w:val="26"/>
-                <w:szCs w:val="26"/>
-                <w:highlight w:val="yellow"/>
-              </w:rPr>
-              <w:t>thu</w:t>
-            </w:r>
-            <w:proofErr w:type="spellEnd"/>
-            <w:r>
-              <w:rPr>
-                <w:rFonts w:ascii="Times New Roman" w:hAnsi="Times New Roman" w:cs="Times New Roman"/>
-                <w:sz w:val="26"/>
-                <w:szCs w:val="26"/>
-                <w:highlight w:val="yellow"/>
-              </w:rPr>
-              <w:t xml:space="preserve"> </w:t>
-            </w:r>
-            <w:proofErr w:type="spellStart"/>
-            <w:r>
-              <w:rPr>
-                <w:rFonts w:ascii="Times New Roman" w:hAnsi="Times New Roman" w:cs="Times New Roman"/>
-                <w:sz w:val="26"/>
-                <w:szCs w:val="26"/>
-                <w:highlight w:val="yellow"/>
-              </w:rPr>
-              <w:t>thực</w:t>
-            </w:r>
-            <w:proofErr w:type="spellEnd"/>
-            <w:r>
-              <w:rPr>
-                <w:rFonts w:ascii="Times New Roman" w:hAnsi="Times New Roman" w:cs="Times New Roman"/>
-                <w:sz w:val="26"/>
-                <w:szCs w:val="26"/>
-                <w:highlight w:val="yellow"/>
-              </w:rPr>
-              <w:t xml:space="preserve"> </w:t>
-            </w:r>
-            <w:proofErr w:type="spellStart"/>
-            <w:r>
-              <w:rPr>
-                <w:rFonts w:ascii="Times New Roman" w:hAnsi="Times New Roman" w:cs="Times New Roman"/>
-                <w:sz w:val="26"/>
-                <w:szCs w:val="26"/>
-                <w:highlight w:val="yellow"/>
-              </w:rPr>
-              <w:t>tế</w:t>
-            </w:r>
-            <w:proofErr w:type="spellEnd"/>
-            <w:r>
-              <w:rPr>
-                <w:rFonts w:ascii="Times New Roman" w:hAnsi="Times New Roman" w:cs="Times New Roman"/>
-                <w:sz w:val="26"/>
-                <w:szCs w:val="26"/>
-                <w:highlight w:val="yellow"/>
-              </w:rPr>
-              <w:t xml:space="preserve"> </w:t>
-            </w:r>
-            <w:proofErr w:type="spellStart"/>
-            <w:r>
-              <w:rPr>
-                <w:rFonts w:ascii="Times New Roman" w:hAnsi="Times New Roman" w:cs="Times New Roman"/>
-                <w:sz w:val="26"/>
-                <w:szCs w:val="26"/>
-                <w:highlight w:val="yellow"/>
-              </w:rPr>
-              <w:t>có</w:t>
-            </w:r>
-            <w:proofErr w:type="spellEnd"/>
-            <w:r>
-              <w:rPr>
-                <w:rFonts w:ascii="Times New Roman" w:hAnsi="Times New Roman" w:cs="Times New Roman"/>
-                <w:sz w:val="26"/>
-                <w:szCs w:val="26"/>
-                <w:highlight w:val="yellow"/>
-              </w:rPr>
-              <w:t xml:space="preserve"> </w:t>
-            </w:r>
-            <w:proofErr w:type="spellStart"/>
-            <w:r>
-              <w:rPr>
-                <w:rFonts w:ascii="Times New Roman" w:hAnsi="Times New Roman" w:cs="Times New Roman"/>
-                <w:sz w:val="26"/>
-                <w:szCs w:val="26"/>
-                <w:highlight w:val="yellow"/>
-              </w:rPr>
-              <w:t>đạt</w:t>
-            </w:r>
-            <w:proofErr w:type="spellEnd"/>
-            <w:r>
-              <w:rPr>
-                <w:rFonts w:ascii="Times New Roman" w:hAnsi="Times New Roman" w:cs="Times New Roman"/>
-                <w:sz w:val="26"/>
-                <w:szCs w:val="26"/>
-                <w:highlight w:val="yellow"/>
-              </w:rPr>
-              <w:t xml:space="preserve"> target </w:t>
-            </w:r>
-            <w:proofErr w:type="spellStart"/>
-            <w:r>
-              <w:rPr>
-                <w:rFonts w:ascii="Times New Roman" w:hAnsi="Times New Roman" w:cs="Times New Roman"/>
-                <w:sz w:val="26"/>
-                <w:szCs w:val="26"/>
-                <w:highlight w:val="yellow"/>
-              </w:rPr>
-              <w:t>giả</w:t>
-            </w:r>
-            <w:proofErr w:type="spellEnd"/>
-            <w:r>
-              <w:rPr>
-                <w:rFonts w:ascii="Times New Roman" w:hAnsi="Times New Roman" w:cs="Times New Roman"/>
-                <w:sz w:val="26"/>
-                <w:szCs w:val="26"/>
-                <w:highlight w:val="yellow"/>
-              </w:rPr>
-              <w:t xml:space="preserve"> </w:t>
-            </w:r>
-            <w:proofErr w:type="spellStart"/>
-            <w:r>
-              <w:rPr>
-                <w:rFonts w:ascii="Times New Roman" w:hAnsi="Times New Roman" w:cs="Times New Roman"/>
-                <w:sz w:val="26"/>
-                <w:szCs w:val="26"/>
-                <w:highlight w:val="yellow"/>
-              </w:rPr>
-              <w:t>định</w:t>
-            </w:r>
-            <w:proofErr w:type="spellEnd"/>
-            <w:r>
-              <w:rPr>
-                <w:rFonts w:ascii="Times New Roman" w:hAnsi="Times New Roman" w:cs="Times New Roman"/>
-                <w:sz w:val="26"/>
-                <w:szCs w:val="26"/>
-                <w:highlight w:val="yellow"/>
-              </w:rPr>
-              <w:t xml:space="preserve"> </w:t>
-            </w:r>
-            <w:proofErr w:type="spellStart"/>
-            <w:r>
-              <w:rPr>
-                <w:rFonts w:ascii="Times New Roman" w:hAnsi="Times New Roman" w:cs="Times New Roman"/>
-                <w:sz w:val="26"/>
-                <w:szCs w:val="26"/>
-                <w:highlight w:val="yellow"/>
-              </w:rPr>
-              <w:t>theo</w:t>
-            </w:r>
-            <w:proofErr w:type="spellEnd"/>
-            <w:r>
-              <w:rPr>
-                <w:rFonts w:ascii="Times New Roman" w:hAnsi="Times New Roman" w:cs="Times New Roman"/>
-                <w:sz w:val="26"/>
-                <w:szCs w:val="26"/>
-                <w:highlight w:val="yellow"/>
-              </w:rPr>
-              <w:t xml:space="preserve"> </w:t>
-            </w:r>
-            <w:proofErr w:type="spellStart"/>
-            <w:r>
-              <w:rPr>
-                <w:rFonts w:ascii="Times New Roman" w:hAnsi="Times New Roman" w:cs="Times New Roman"/>
-                <w:sz w:val="26"/>
-                <w:szCs w:val="26"/>
-                <w:highlight w:val="yellow"/>
-              </w:rPr>
-              <w:t>tháng</w:t>
-            </w:r>
-            <w:proofErr w:type="spellEnd"/>
-            <w:r>
-              <w:rPr>
-                <w:rFonts w:ascii="Times New Roman" w:hAnsi="Times New Roman" w:cs="Times New Roman"/>
-                <w:sz w:val="26"/>
-                <w:szCs w:val="26"/>
-                <w:highlight w:val="yellow"/>
-              </w:rPr>
-              <w:t xml:space="preserve"> </w:t>
-            </w:r>
-            <w:proofErr w:type="spellStart"/>
-            <w:r>
-              <w:rPr>
-                <w:rFonts w:ascii="Times New Roman" w:hAnsi="Times New Roman" w:cs="Times New Roman"/>
-                <w:sz w:val="26"/>
-                <w:szCs w:val="26"/>
-                <w:highlight w:val="yellow"/>
-              </w:rPr>
-              <w:t>không</w:t>
-            </w:r>
-            <w:proofErr w:type="spellEnd"/>
-            <w:r>
-              <w:rPr>
-                <w:rFonts w:ascii="Times New Roman" w:hAnsi="Times New Roman" w:cs="Times New Roman"/>
-                <w:sz w:val="26"/>
-                <w:szCs w:val="26"/>
-                <w:highlight w:val="yellow"/>
-              </w:rPr>
-              <w:t>?</w:t>
-            </w:r>
-          </w:p>
-        </w:tc>
-        <w:tc>
-          <w:tcPr>
-            <w:tcW w:w="2801" w:type="dxa"/>
-            <w:tcBorders>
-              <w:top w:val="single" w:sz="4" w:space="0" w:color="BFBFBF"/>
-              <w:left w:val="single" w:sz="4" w:space="0" w:color="BFBFBF"/>
-              <w:bottom w:val="single" w:sz="4" w:space="0" w:color="BFBFBF"/>
-              <w:right w:val="single" w:sz="4" w:space="0" w:color="BFBFBF"/>
-            </w:tcBorders>
-            <w:vAlign w:val="center"/>
-          </w:tcPr>
-          <w:p>
-            <w:pPr>
-              <w:spacing w:before="100" w:beforeAutospacing="1" w:after="100" w:afterAutospacing="1" w:line="240" w:lineRule="auto"/>
-              <w:rPr>
-                <w:rFonts w:ascii="Times New Roman" w:hAnsi="Times New Roman" w:cs="Times New Roman"/>
-                <w:sz w:val="26"/>
-                <w:szCs w:val="26"/>
-                <w:highlight w:val="yellow"/>
-              </w:rPr>
-            </w:pPr>
-            <w:r>
-              <w:rPr>
-                <w:rFonts w:ascii="Times New Roman" w:hAnsi="Times New Roman" w:cs="Times New Roman"/>
-                <w:sz w:val="26"/>
-                <w:szCs w:val="26"/>
-                <w:highlight w:val="yellow"/>
-              </w:rPr>
-              <w:t>Budget Variance</w:t>
-            </w:r>
-          </w:p>
-        </w:tc>
-      </w:tr>
-      <w:tr>
-        <w:trPr>
-          <w:cantSplit/>
-          <w:trHeight w:val="576"/>
-          <w:jc w:val="center"/>
-        </w:trPr>
-        <w:tc>
-          <w:tcPr>
-            <w:tcW w:w="7201" w:type="dxa"/>
-            <w:tcBorders>
-              <w:top w:val="single" w:sz="4" w:space="0" w:color="BFBFBF"/>
-              <w:left w:val="single" w:sz="4" w:space="0" w:color="BFBFBF"/>
-              <w:bottom w:val="single" w:sz="4" w:space="0" w:color="BFBFBF"/>
-              <w:right w:val="single" w:sz="4" w:space="0" w:color="BFBFBF"/>
-            </w:tcBorders>
-            <w:vAlign w:val="center"/>
-          </w:tcPr>
-          <w:p>
-            <w:pPr>
-              <w:spacing w:before="100" w:beforeAutospacing="1" w:after="100" w:afterAutospacing="1" w:line="240" w:lineRule="auto"/>
-              <w:rPr>
-                <w:rFonts w:ascii="Times New Roman" w:hAnsi="Times New Roman" w:cs="Times New Roman"/>
-                <w:sz w:val="26"/>
-                <w:szCs w:val="26"/>
-                <w:highlight w:val="yellow"/>
-              </w:rPr>
-            </w:pPr>
-            <w:proofErr w:type="spellStart"/>
-            <w:r>
-              <w:rPr>
-                <w:rFonts w:ascii="Times New Roman" w:hAnsi="Times New Roman" w:cs="Times New Roman"/>
-                <w:sz w:val="26"/>
-                <w:szCs w:val="26"/>
-                <w:highlight w:val="yellow"/>
-              </w:rPr>
-              <w:t>Có</w:t>
-            </w:r>
-            <w:proofErr w:type="spellEnd"/>
-            <w:r>
-              <w:rPr>
-                <w:rFonts w:ascii="Times New Roman" w:hAnsi="Times New Roman" w:cs="Times New Roman"/>
-                <w:sz w:val="26"/>
-                <w:szCs w:val="26"/>
-                <w:highlight w:val="yellow"/>
-              </w:rPr>
-              <w:t xml:space="preserve"> </w:t>
-            </w:r>
-            <w:proofErr w:type="spellStart"/>
-            <w:r>
-              <w:rPr>
-                <w:rFonts w:ascii="Times New Roman" w:hAnsi="Times New Roman" w:cs="Times New Roman"/>
-                <w:sz w:val="26"/>
-                <w:szCs w:val="26"/>
-                <w:highlight w:val="yellow"/>
-              </w:rPr>
-              <w:t>thể</w:t>
-            </w:r>
-            <w:proofErr w:type="spellEnd"/>
-            <w:r>
-              <w:rPr>
-                <w:rFonts w:ascii="Times New Roman" w:hAnsi="Times New Roman" w:cs="Times New Roman"/>
-                <w:sz w:val="26"/>
-                <w:szCs w:val="26"/>
-                <w:highlight w:val="yellow"/>
-              </w:rPr>
-              <w:t xml:space="preserve"> </w:t>
-            </w:r>
-            <w:proofErr w:type="spellStart"/>
-            <w:r>
-              <w:rPr>
-                <w:rFonts w:ascii="Times New Roman" w:hAnsi="Times New Roman" w:cs="Times New Roman"/>
-                <w:sz w:val="26"/>
-                <w:szCs w:val="26"/>
-                <w:highlight w:val="yellow"/>
-              </w:rPr>
-              <w:t>dự</w:t>
-            </w:r>
-            <w:proofErr w:type="spellEnd"/>
-            <w:r>
-              <w:rPr>
-                <w:rFonts w:ascii="Times New Roman" w:hAnsi="Times New Roman" w:cs="Times New Roman"/>
-                <w:sz w:val="26"/>
-                <w:szCs w:val="26"/>
-                <w:highlight w:val="yellow"/>
-              </w:rPr>
-              <w:t xml:space="preserve"> </w:t>
-            </w:r>
-            <w:proofErr w:type="spellStart"/>
-            <w:r>
-              <w:rPr>
-                <w:rFonts w:ascii="Times New Roman" w:hAnsi="Times New Roman" w:cs="Times New Roman"/>
-                <w:sz w:val="26"/>
-                <w:szCs w:val="26"/>
-                <w:highlight w:val="yellow"/>
-              </w:rPr>
-              <w:t>đoán</w:t>
-            </w:r>
-            <w:proofErr w:type="spellEnd"/>
-            <w:r>
-              <w:rPr>
-                <w:rFonts w:ascii="Times New Roman" w:hAnsi="Times New Roman" w:cs="Times New Roman"/>
-                <w:sz w:val="26"/>
-                <w:szCs w:val="26"/>
-                <w:highlight w:val="yellow"/>
-              </w:rPr>
-              <w:t xml:space="preserve"> </w:t>
-            </w:r>
-            <w:proofErr w:type="spellStart"/>
-            <w:r>
-              <w:rPr>
-                <w:rFonts w:ascii="Times New Roman" w:hAnsi="Times New Roman" w:cs="Times New Roman"/>
-                <w:sz w:val="26"/>
-                <w:szCs w:val="26"/>
-                <w:highlight w:val="yellow"/>
-              </w:rPr>
-              <w:t>đơn</w:t>
-            </w:r>
-            <w:proofErr w:type="spellEnd"/>
-            <w:r>
-              <w:rPr>
-                <w:rFonts w:ascii="Times New Roman" w:hAnsi="Times New Roman" w:cs="Times New Roman"/>
-                <w:sz w:val="26"/>
-                <w:szCs w:val="26"/>
-                <w:highlight w:val="yellow"/>
-              </w:rPr>
-              <w:t xml:space="preserve"> </w:t>
-            </w:r>
-            <w:proofErr w:type="spellStart"/>
-            <w:r>
-              <w:rPr>
-                <w:rFonts w:ascii="Times New Roman" w:hAnsi="Times New Roman" w:cs="Times New Roman"/>
-                <w:sz w:val="26"/>
-                <w:szCs w:val="26"/>
-                <w:highlight w:val="yellow"/>
-              </w:rPr>
-              <w:t>hàng</w:t>
-            </w:r>
-            <w:proofErr w:type="spellEnd"/>
-            <w:r>
-              <w:rPr>
-                <w:rFonts w:ascii="Times New Roman" w:hAnsi="Times New Roman" w:cs="Times New Roman"/>
-                <w:sz w:val="26"/>
-                <w:szCs w:val="26"/>
-                <w:highlight w:val="yellow"/>
-              </w:rPr>
-              <w:t xml:space="preserve"> </w:t>
-            </w:r>
-            <w:proofErr w:type="spellStart"/>
-            <w:r>
-              <w:rPr>
-                <w:rFonts w:ascii="Times New Roman" w:hAnsi="Times New Roman" w:cs="Times New Roman"/>
-                <w:sz w:val="26"/>
-                <w:szCs w:val="26"/>
-                <w:highlight w:val="yellow"/>
-              </w:rPr>
-              <w:t>bị</w:t>
-            </w:r>
-            <w:proofErr w:type="spellEnd"/>
-            <w:r>
-              <w:rPr>
-                <w:rFonts w:ascii="Times New Roman" w:hAnsi="Times New Roman" w:cs="Times New Roman"/>
-                <w:sz w:val="26"/>
-                <w:szCs w:val="26"/>
-                <w:highlight w:val="yellow"/>
-              </w:rPr>
-              <w:t xml:space="preserve"> review </w:t>
-            </w:r>
-            <w:proofErr w:type="spellStart"/>
-            <w:r>
-              <w:rPr>
-                <w:rFonts w:ascii="Times New Roman" w:hAnsi="Times New Roman" w:cs="Times New Roman"/>
-                <w:sz w:val="26"/>
-                <w:szCs w:val="26"/>
-                <w:highlight w:val="yellow"/>
-              </w:rPr>
-              <w:t>xấu</w:t>
-            </w:r>
-            <w:proofErr w:type="spellEnd"/>
-            <w:r>
-              <w:rPr>
-                <w:rFonts w:ascii="Times New Roman" w:hAnsi="Times New Roman" w:cs="Times New Roman"/>
-                <w:sz w:val="26"/>
-                <w:szCs w:val="26"/>
-                <w:highlight w:val="yellow"/>
-              </w:rPr>
-              <w:t xml:space="preserve"> </w:t>
-            </w:r>
-            <w:proofErr w:type="spellStart"/>
-            <w:r>
-              <w:rPr>
-                <w:rFonts w:ascii="Times New Roman" w:hAnsi="Times New Roman" w:cs="Times New Roman"/>
-                <w:sz w:val="26"/>
-                <w:szCs w:val="26"/>
-                <w:highlight w:val="yellow"/>
-              </w:rPr>
-              <w:t>không</w:t>
-            </w:r>
-            <w:proofErr w:type="spellEnd"/>
-            <w:r>
-              <w:rPr>
-                <w:rFonts w:ascii="Times New Roman" w:hAnsi="Times New Roman" w:cs="Times New Roman"/>
-                <w:sz w:val="26"/>
-                <w:szCs w:val="26"/>
-                <w:highlight w:val="yellow"/>
-              </w:rPr>
-              <w:t>?</w:t>
-            </w:r>
-          </w:p>
-        </w:tc>
-        <w:tc>
-          <w:tcPr>
-            <w:tcW w:w="2801" w:type="dxa"/>
-            <w:tcBorders>
-              <w:top w:val="single" w:sz="4" w:space="0" w:color="BFBFBF"/>
-              <w:left w:val="single" w:sz="4" w:space="0" w:color="BFBFBF"/>
-              <w:bottom w:val="single" w:sz="4" w:space="0" w:color="BFBFBF"/>
-              <w:right w:val="single" w:sz="4" w:space="0" w:color="BFBFBF"/>
-            </w:tcBorders>
-            <w:vAlign w:val="center"/>
-          </w:tcPr>
-          <w:p>
-            <w:pPr>
-              <w:spacing w:before="100" w:beforeAutospacing="1" w:after="100" w:afterAutospacing="1" w:line="240" w:lineRule="auto"/>
-              <w:rPr>
-                <w:rFonts w:ascii="Times New Roman" w:hAnsi="Times New Roman" w:cs="Times New Roman"/>
-                <w:sz w:val="26"/>
-                <w:szCs w:val="26"/>
-                <w:highlight w:val="yellow"/>
-              </w:rPr>
-            </w:pPr>
-            <w:r>
-              <w:rPr>
-                <w:rFonts w:ascii="Times New Roman" w:hAnsi="Times New Roman" w:cs="Times New Roman"/>
-                <w:sz w:val="26"/>
-                <w:szCs w:val="26"/>
-                <w:highlight w:val="yellow"/>
-              </w:rPr>
-              <w:t>Bad Review Classification</w:t>
             </w:r>
           </w:p>
         </w:tc>

</xml_diff>